<commit_message>
final version of the documentation ?
</commit_message>
<xml_diff>
--- a/documentation/D05_Arh_projekat.docx
+++ b/documentation/D05_Arh_projekat.docx
@@ -124,16 +124,16 @@
         <w:tblLook w:val="0000" w:noHBand="0" w:noVBand="0" w:firstColumn="0" w:lastRow="0" w:lastColumn="0" w:firstRow="0"/>
       </w:tblPr>
       <w:tblGrid>
-        <w:gridCol w:w="2302"/>
+        <w:gridCol w:w="2301"/>
         <w:gridCol w:w="1152"/>
-        <w:gridCol w:w="3746"/>
+        <w:gridCol w:w="3747"/>
         <w:gridCol w:w="2304"/>
       </w:tblGrid>
       <w:tr>
         <w:trPr/>
         <w:tc>
           <w:tcPr>
-            <w:tcW w:w="2302" w:type="dxa"/>
+            <w:tcW w:w="2301" w:type="dxa"/>
             <w:tcBorders>
               <w:top w:val="single" w:sz="6" w:space="0" w:color="000000"/>
               <w:left w:val="single" w:sz="6" w:space="0" w:color="000000"/>
@@ -191,7 +191,7 @@
         </w:tc>
         <w:tc>
           <w:tcPr>
-            <w:tcW w:w="3746" w:type="dxa"/>
+            <w:tcW w:w="3747" w:type="dxa"/>
             <w:tcBorders>
               <w:top w:val="single" w:sz="6" w:space="0" w:color="000000"/>
               <w:left w:val="single" w:sz="6" w:space="0" w:color="000000"/>
@@ -252,7 +252,7 @@
         <w:trPr/>
         <w:tc>
           <w:tcPr>
-            <w:tcW w:w="2302" w:type="dxa"/>
+            <w:tcW w:w="2301" w:type="dxa"/>
             <w:tcBorders>
               <w:top w:val="single" w:sz="6" w:space="0" w:color="000000"/>
               <w:left w:val="single" w:sz="6" w:space="0" w:color="000000"/>
@@ -304,7 +304,7 @@
         </w:tc>
         <w:tc>
           <w:tcPr>
-            <w:tcW w:w="3746" w:type="dxa"/>
+            <w:tcW w:w="3747" w:type="dxa"/>
             <w:tcBorders>
               <w:top w:val="single" w:sz="6" w:space="0" w:color="000000"/>
               <w:left w:val="single" w:sz="6" w:space="0" w:color="000000"/>
@@ -359,7 +359,122 @@
         <w:trPr/>
         <w:tc>
           <w:tcPr>
-            <w:tcW w:w="2302" w:type="dxa"/>
+            <w:tcW w:w="2301" w:type="dxa"/>
+            <w:tcBorders>
+              <w:top w:val="single" w:sz="6" w:space="0" w:color="000000"/>
+              <w:left w:val="single" w:sz="6" w:space="0" w:color="000000"/>
+              <w:bottom w:val="single" w:sz="6" w:space="0" w:color="000000"/>
+              <w:right w:val="single" w:sz="6" w:space="0" w:color="000000"/>
+            </w:tcBorders>
+          </w:tcPr>
+          <w:p>
+            <w:pPr>
+              <w:pStyle w:val="Tabletext"/>
+              <w:spacing w:before="0" w:after="120"/>
+              <w:rPr>
+                <w:lang w:val="sr-Latn-CS"/>
+              </w:rPr>
+            </w:pPr>
+            <w:r>
+              <w:rPr/>
+              <w:t>2</w:t>
+            </w:r>
+            <w:r>
+              <w:rPr/>
+              <w:t>9</w:t>
+            </w:r>
+            <w:r>
+              <w:rPr/>
+              <w:t>.10.2025.</w:t>
+            </w:r>
+          </w:p>
+        </w:tc>
+        <w:tc>
+          <w:tcPr>
+            <w:tcW w:w="1152" w:type="dxa"/>
+            <w:tcBorders>
+              <w:top w:val="single" w:sz="6" w:space="0" w:color="000000"/>
+              <w:left w:val="single" w:sz="6" w:space="0" w:color="000000"/>
+              <w:bottom w:val="single" w:sz="6" w:space="0" w:color="000000"/>
+              <w:right w:val="single" w:sz="6" w:space="0" w:color="000000"/>
+            </w:tcBorders>
+          </w:tcPr>
+          <w:p>
+            <w:pPr>
+              <w:pStyle w:val="Tabletext"/>
+              <w:spacing w:before="0" w:after="120"/>
+              <w:rPr>
+                <w:lang w:val="sr-Latn-CS"/>
+              </w:rPr>
+            </w:pPr>
+            <w:r>
+              <w:rPr/>
+              <w:t>1.</w:t>
+            </w:r>
+            <w:r>
+              <w:rPr/>
+              <w:t>1</w:t>
+            </w:r>
+          </w:p>
+        </w:tc>
+        <w:tc>
+          <w:tcPr>
+            <w:tcW w:w="3747" w:type="dxa"/>
+            <w:tcBorders>
+              <w:top w:val="single" w:sz="6" w:space="0" w:color="000000"/>
+              <w:left w:val="single" w:sz="6" w:space="0" w:color="000000"/>
+              <w:bottom w:val="single" w:sz="6" w:space="0" w:color="000000"/>
+              <w:right w:val="single" w:sz="6" w:space="0" w:color="000000"/>
+            </w:tcBorders>
+          </w:tcPr>
+          <w:p>
+            <w:pPr>
+              <w:pStyle w:val="Tabletext"/>
+              <w:spacing w:before="0" w:after="120"/>
+              <w:rPr>
+                <w:lang w:val="sr-Latn-CS"/>
+              </w:rPr>
+            </w:pPr>
+            <w:r>
+              <w:rPr>
+                <w:lang w:val="sr-Latn-CS"/>
+              </w:rPr>
+              <w:t>Konačna verzija</w:t>
+            </w:r>
+          </w:p>
+        </w:tc>
+        <w:tc>
+          <w:tcPr>
+            <w:tcW w:w="2304" w:type="dxa"/>
+            <w:tcBorders>
+              <w:top w:val="single" w:sz="6" w:space="0" w:color="000000"/>
+              <w:left w:val="single" w:sz="6" w:space="0" w:color="000000"/>
+              <w:bottom w:val="single" w:sz="6" w:space="0" w:color="000000"/>
+              <w:right w:val="single" w:sz="6" w:space="0" w:color="000000"/>
+            </w:tcBorders>
+          </w:tcPr>
+          <w:p>
+            <w:pPr>
+              <w:pStyle w:val="Tabletext"/>
+              <w:spacing w:before="0" w:after="120"/>
+              <w:rPr>
+                <w:lang w:val="sr-Latn-CS"/>
+              </w:rPr>
+            </w:pPr>
+            <w:r>
+              <w:rPr>
+                <w:lang w:val="sr-Latn-CS"/>
+              </w:rPr>
+              <w:t>Aleksandar</w:t>
+            </w:r>
+          </w:p>
+        </w:tc>
+      </w:tr>
+      <w:tr>
+        <w:trPr/>
+        <w:tc>
+          <w:tcPr>
+            <w:tcW w:w="2301" w:type="dxa"/>
             <w:tcBorders>
               <w:top w:val="single" w:sz="6" w:space="0" w:color="000000"/>
               <w:left w:val="single" w:sz="6" w:space="0" w:color="000000"/>
@@ -409,7 +524,7 @@
         </w:tc>
         <w:tc>
           <w:tcPr>
-            <w:tcW w:w="3746" w:type="dxa"/>
+            <w:tcW w:w="3747" w:type="dxa"/>
             <w:tcBorders>
               <w:top w:val="single" w:sz="6" w:space="0" w:color="000000"/>
               <w:left w:val="single" w:sz="6" w:space="0" w:color="000000"/>
@@ -462,7 +577,7 @@
         <w:trPr/>
         <w:tc>
           <w:tcPr>
-            <w:tcW w:w="2302" w:type="dxa"/>
+            <w:tcW w:w="2301" w:type="dxa"/>
             <w:tcBorders>
               <w:top w:val="single" w:sz="6" w:space="0" w:color="000000"/>
               <w:left w:val="single" w:sz="6" w:space="0" w:color="000000"/>
@@ -512,110 +627,7 @@
         </w:tc>
         <w:tc>
           <w:tcPr>
-            <w:tcW w:w="3746" w:type="dxa"/>
-            <w:tcBorders>
-              <w:top w:val="single" w:sz="6" w:space="0" w:color="000000"/>
-              <w:left w:val="single" w:sz="6" w:space="0" w:color="000000"/>
-              <w:bottom w:val="single" w:sz="6" w:space="0" w:color="000000"/>
-              <w:right w:val="single" w:sz="6" w:space="0" w:color="000000"/>
-            </w:tcBorders>
-          </w:tcPr>
-          <w:p>
-            <w:pPr>
-              <w:pStyle w:val="Tabletext"/>
-              <w:spacing w:before="0" w:after="120"/>
-              <w:rPr>
-                <w:lang w:val="sr-Latn-CS"/>
-              </w:rPr>
-            </w:pPr>
-            <w:r>
-              <w:rPr>
-                <w:lang w:val="sr-Latn-CS"/>
-              </w:rPr>
-            </w:r>
-          </w:p>
-        </w:tc>
-        <w:tc>
-          <w:tcPr>
-            <w:tcW w:w="2304" w:type="dxa"/>
-            <w:tcBorders>
-              <w:top w:val="single" w:sz="6" w:space="0" w:color="000000"/>
-              <w:left w:val="single" w:sz="6" w:space="0" w:color="000000"/>
-              <w:bottom w:val="single" w:sz="6" w:space="0" w:color="000000"/>
-              <w:right w:val="single" w:sz="6" w:space="0" w:color="000000"/>
-            </w:tcBorders>
-          </w:tcPr>
-          <w:p>
-            <w:pPr>
-              <w:pStyle w:val="Tabletext"/>
-              <w:spacing w:before="0" w:after="120"/>
-              <w:rPr>
-                <w:lang w:val="sr-Latn-CS"/>
-              </w:rPr>
-            </w:pPr>
-            <w:r>
-              <w:rPr>
-                <w:lang w:val="sr-Latn-CS"/>
-              </w:rPr>
-            </w:r>
-          </w:p>
-        </w:tc>
-      </w:tr>
-      <w:tr>
-        <w:trPr/>
-        <w:tc>
-          <w:tcPr>
-            <w:tcW w:w="2302" w:type="dxa"/>
-            <w:tcBorders>
-              <w:top w:val="single" w:sz="6" w:space="0" w:color="000000"/>
-              <w:left w:val="single" w:sz="6" w:space="0" w:color="000000"/>
-              <w:bottom w:val="single" w:sz="6" w:space="0" w:color="000000"/>
-              <w:right w:val="single" w:sz="6" w:space="0" w:color="000000"/>
-            </w:tcBorders>
-          </w:tcPr>
-          <w:p>
-            <w:pPr>
-              <w:pStyle w:val="Tabletext"/>
-              <w:spacing w:before="0" w:after="120"/>
-              <w:rPr>
-                <w:lang w:val="sr-Latn-CS"/>
-              </w:rPr>
-            </w:pPr>
-            <w:r>
-              <w:rPr>
-                <w:lang w:val="sr-Latn-CS"/>
-              </w:rPr>
-            </w:r>
-          </w:p>
-        </w:tc>
-        <w:tc>
-          <w:tcPr>
-            <w:tcW w:w="1152" w:type="dxa"/>
-            <w:tcBorders>
-              <w:top w:val="single" w:sz="6" w:space="0" w:color="000000"/>
-              <w:left w:val="single" w:sz="6" w:space="0" w:color="000000"/>
-              <w:bottom w:val="single" w:sz="6" w:space="0" w:color="000000"/>
-              <w:right w:val="single" w:sz="6" w:space="0" w:color="000000"/>
-            </w:tcBorders>
-          </w:tcPr>
-          <w:p>
-            <w:pPr>
-              <w:pStyle w:val="Tabletext"/>
-              <w:spacing w:before="0" w:after="120"/>
-              <w:rPr>
-                <w:lang w:val="sr-Latn-CS"/>
-              </w:rPr>
-            </w:pPr>
-            <w:r>
-              <w:rPr>
-                <w:lang w:val="sr-Latn-CS"/>
-              </w:rPr>
-            </w:r>
-          </w:p>
-        </w:tc>
-        <w:tc>
-          <w:tcPr>
-            <w:tcW w:w="3746" w:type="dxa"/>
+            <w:tcW w:w="3747" w:type="dxa"/>
             <w:tcBorders>
               <w:top w:val="single" w:sz="6" w:space="0" w:color="000000"/>
               <w:left w:val="single" w:sz="6" w:space="0" w:color="000000"/>
@@ -10975,21 +10987,10 @@
         <w:rPr>
           <w:lang w:val="sr-Latn-CS"/>
         </w:rPr>
-        <w:t xml:space="preserve">Komponenta </w:t>
-      </w:r>
-      <w:r>
-        <w:rPr>
-          <w:b/>
-          <w:bCs/>
-          <w:lang w:val="sr-Latn-CS"/>
-        </w:rPr>
-        <w:t>index.php</w:t>
-      </w:r>
-      <w:r>
-        <w:rPr>
-          <w:lang w:val="sr-Latn-CS"/>
-        </w:rPr>
-        <w:t xml:space="preserve"> je implementira stranicu portala čiji sadržaj može da varira od parametra koji joj se proslede u zahtevu. </w:t>
+        <w:br/>
+      </w:r>
+      <w:r>
+        <w:br w:type="page"/>
       </w:r>
     </w:p>
     <w:p>
@@ -11002,68 +11003,19 @@
         </w:rPr>
       </w:pPr>
       <w:r>
-        <w:rPr>
-          <w:lang w:val="sr-Latn-CS"/>
-        </w:rPr>
-        <w:t xml:space="preserve">Komponenta </w:t>
-      </w:r>
-      <w:r>
-        <w:rPr>
-          <w:b/>
-          <w:bCs/>
-          <w:lang w:val="sr-Latn-CS"/>
-        </w:rPr>
-        <w:t>main.css</w:t>
-      </w:r>
-      <w:r>
-        <w:rPr>
-          <w:lang w:val="sr-Latn-CS"/>
-        </w:rPr>
-        <w:t xml:space="preserve"> pred</w:t>
-        <w:tab/>
-        <w:tab/>
-        <w:t>stavlja opis stilova za pojedine HTML elemente koji se javljaju na različitim stranicama.</w:t>
-      </w:r>
-    </w:p>
-    <w:p>
-      <w:pPr>
-        <w:pStyle w:val="Normal"/>
-        <w:widowControl/>
-        <w:ind w:left="709"/>
-        <w:rPr>
-          <w:lang w:val="sr-Latn-CS"/>
-        </w:rPr>
-      </w:pPr>
-      <w:r>
-        <w:rPr>
-          <w:lang w:val="sr-Latn-CS"/>
-        </w:rPr>
-        <w:t>Parametri koji utiču na izbor i jezik za prikaz stranice ilustrovani su sledećim dijagramom klasa:</w:t>
-      </w:r>
-    </w:p>
-    <w:p>
-      <w:pPr>
-        <w:pStyle w:val="Normal"/>
-        <w:widowControl/>
-        <w:ind w:left="709"/>
-        <w:rPr>
-          <w:lang w:val="sr-Latn-CS"/>
-        </w:rPr>
-      </w:pPr>
-      <w:r>
         <w:drawing>
-          <wp:anchor behindDoc="0" distT="0" distB="0" distL="0" distR="114300" simplePos="0" locked="0" layoutInCell="0" allowOverlap="1" relativeHeight="18">
+          <wp:anchor behindDoc="0" distT="0" distB="0" distL="0" distR="0" simplePos="0" locked="0" layoutInCell="0" allowOverlap="1" relativeHeight="18">
             <wp:simplePos x="0" y="0"/>
             <wp:positionH relativeFrom="column">
-              <wp:align>left</wp:align>
+              <wp:posOffset>225425</wp:posOffset>
             </wp:positionH>
             <wp:positionV relativeFrom="paragraph">
-              <wp:posOffset>635</wp:posOffset>
+              <wp:posOffset>690880</wp:posOffset>
             </wp:positionV>
-            <wp:extent cx="1409700" cy="1511935"/>
+            <wp:extent cx="5493385" cy="5502910"/>
             <wp:effectExtent l="0" t="0" r="0" b="0"/>
-            <wp:wrapSquare wrapText="bothSides"/>
-            <wp:docPr id="13" name="Picture 11"/>
+            <wp:wrapSquare wrapText="largest"/>
+            <wp:docPr id="13" name="Image1"/>
             <wp:cNvGraphicFramePr>
               <a:graphicFrameLocks xmlns:a="http://schemas.openxmlformats.org/drawingml/2006/main" noChangeAspect="1"/>
             </wp:cNvGraphicFramePr>
@@ -11071,7 +11023,7 @@
               <a:graphicData uri="http://schemas.openxmlformats.org/drawingml/2006/picture">
                 <pic:pic xmlns:pic="http://schemas.openxmlformats.org/drawingml/2006/picture">
                   <pic:nvPicPr>
-                    <pic:cNvPr id="13" name="Picture 11"/>
+                    <pic:cNvPr id="13" name="Image1"/>
                     <pic:cNvPicPr>
                       <a:picLocks noChangeAspect="1" noChangeArrowheads="1"/>
                     </pic:cNvPicPr>
@@ -11085,7 +11037,7 @@
                   <pic:spPr bwMode="auto">
                     <a:xfrm>
                       <a:off x="0" y="0"/>
-                      <a:ext cx="1409700" cy="1511935"/>
+                      <a:ext cx="5493385" cy="5502910"/>
                     </a:xfrm>
                     <a:prstGeom prst="rect">
                       <a:avLst/>
@@ -14040,30 +13992,35 @@
                           <w:r>
                             <w:rPr>
                               <w:rStyle w:val="PageNumber"/>
+                              <w:color w:val="000000"/>
                             </w:rPr>
                             <w:fldChar w:fldCharType="begin"/>
                           </w:r>
                           <w:r>
                             <w:rPr>
                               <w:rStyle w:val="PageNumber"/>
+                              <w:color w:val="000000"/>
                             </w:rPr>
                             <w:instrText xml:space="preserve"> PAGE </w:instrText>
                           </w:r>
                           <w:r>
                             <w:rPr>
                               <w:rStyle w:val="PageNumber"/>
+                              <w:color w:val="000000"/>
                             </w:rPr>
                             <w:fldChar w:fldCharType="separate"/>
                           </w:r>
                           <w:r>
                             <w:rPr>
                               <w:rStyle w:val="PageNumber"/>
+                              <w:color w:val="000000"/>
                             </w:rPr>
                             <w:t>0</w:t>
                           </w:r>
                           <w:r>
                             <w:rPr>
                               <w:rStyle w:val="PageNumber"/>
+                              <w:color w:val="000000"/>
                             </w:rPr>
                             <w:fldChar w:fldCharType="end"/>
                           </w:r>
@@ -14081,8 +14038,8 @@
         </mc:Choice>
         <mc:Fallback>
           <w:pict>
-            <v:rect id="shape_0" ID="Frame1" path="m0,0l-2147483645,0l-2147483645,-2147483646l0,-2147483646xe" fillcolor="white" stroked="f" o:allowincell="f" style="position:absolute;margin-left:0pt;margin-top:0.05pt;width:1.1pt;height:1.1pt;mso-wrap-style:square;v-text-anchor:top;mso-position-horizontal:right;mso-position-horizontal-relative:margin">
-              <v:fill o:detectmouseclick="t" type="solid" color2="black" opacity="0"/>
+            <v:rect id="shape_0" ID="Frame1" path="m0,0l-2147483645,0l-2147483645,-2147483646l0,-2147483646xe" stroked="f" o:allowincell="f" style="position:absolute;margin-left:0pt;margin-top:0.05pt;width:1.1pt;height:1.1pt;mso-wrap-style:square;v-text-anchor:top;mso-position-horizontal:right;mso-position-horizontal-relative:margin">
+              <v:fill o:detectmouseclick="t" on="false"/>
               <v:stroke color="#3465a4" joinstyle="round" endcap="flat"/>
               <v:textbox>
                 <w:txbxContent>
@@ -14096,30 +14053,35 @@
                     <w:r>
                       <w:rPr>
                         <w:rStyle w:val="PageNumber"/>
+                        <w:color w:val="000000"/>
                       </w:rPr>
                       <w:fldChar w:fldCharType="begin"/>
                     </w:r>
                     <w:r>
                       <w:rPr>
                         <w:rStyle w:val="PageNumber"/>
+                        <w:color w:val="000000"/>
                       </w:rPr>
                       <w:instrText xml:space="preserve"> PAGE </w:instrText>
                     </w:r>
                     <w:r>
                       <w:rPr>
                         <w:rStyle w:val="PageNumber"/>
+                        <w:color w:val="000000"/>
                       </w:rPr>
                       <w:fldChar w:fldCharType="separate"/>
                     </w:r>
                     <w:r>
                       <w:rPr>
                         <w:rStyle w:val="PageNumber"/>
+                        <w:color w:val="000000"/>
                       </w:rPr>
                       <w:t>0</w:t>
                     </w:r>
                     <w:r>
                       <w:rPr>
                         <w:rStyle w:val="PageNumber"/>
+                        <w:color w:val="000000"/>
                       </w:rPr>
                       <w:fldChar w:fldCharType="end"/>
                     </w:r>
@@ -14295,7 +14257,7 @@
               <w:rStyle w:val="PageNumber"/>
               <w:lang w:val="sr-Latn-CS"/>
             </w:rPr>
-            <w:t>17</w:t>
+            <w:t>27</w:t>
           </w:r>
           <w:r>
             <w:rPr>
@@ -14325,7 +14287,7 @@
           </w:r>
           <w:r>
             <w:rPr/>
-            <w:t>26</w:t>
+            <w:t>27</w:t>
           </w:r>
           <w:r>
             <w:rPr/>
@@ -14468,7 +14430,7 @@
               <w:rStyle w:val="PageNumber"/>
               <w:lang w:val="sr-Latn-CS"/>
             </w:rPr>
-            <w:t>17</w:t>
+            <w:t>27</w:t>
           </w:r>
           <w:r>
             <w:rPr>
@@ -14498,7 +14460,7 @@
           </w:r>
           <w:r>
             <w:rPr/>
-            <w:t>26</w:t>
+            <w:t>27</w:t>
           </w:r>
           <w:r>
             <w:rPr/>
@@ -16476,17 +16438,16 @@
       <w:color w:val="0000FF"/>
     </w:rPr>
   </w:style>
-  <w:style w:type="character" w:styleId="FootnoteCharactersuser">
-    <w:name w:val="Footnote Characters (user)"/>
-    <w:basedOn w:val="DefaultParagraphFont"/>
+  <w:style w:type="character" w:styleId="FootnoteCharacters">
+    <w:name w:val="Footnote Characters"/>
     <w:semiHidden/>
     <w:qFormat/>
     <w:rPr>
       <w:vertAlign w:val="superscript"/>
     </w:rPr>
   </w:style>
-  <w:style w:type="character" w:styleId="FootnoteCharacters">
-    <w:name w:val="Footnote Characters"/>
+  <w:style w:type="character" w:styleId="FootnoteCharactersuser">
+    <w:name w:val="Footnote Characters (user)"/>
     <w:qFormat/>
     <w:rPr>
       <w:vertAlign w:val="superscript"/>
@@ -16509,8 +16470,8 @@
       <w:bCs/>
     </w:rPr>
   </w:style>
-  <w:style w:type="character" w:styleId="Bulletsuser">
-    <w:name w:val="Bullets (user)"/>
+  <w:style w:type="character" w:styleId="Bullets">
+    <w:name w:val="Bullets"/>
     <w:qFormat/>
     <w:rPr>
       <w:rFonts w:ascii="OpenSymbol" w:hAnsi="OpenSymbol" w:eastAsia="OpenSymbol" w:cs="OpenSymbol"/>
@@ -16891,15 +16852,15 @@
     </w:pPr>
     <w:rPr/>
   </w:style>
-  <w:style w:type="paragraph" w:styleId="FrameContentsuser">
-    <w:name w:val="Frame Contents (user)"/>
+  <w:style w:type="paragraph" w:styleId="FrameContents">
+    <w:name w:val="Frame Contents"/>
     <w:basedOn w:val="Normal"/>
     <w:qFormat/>
     <w:pPr/>
     <w:rPr/>
   </w:style>
-  <w:style w:type="paragraph" w:styleId="FrameContents">
-    <w:name w:val="Frame Contents"/>
+  <w:style w:type="paragraph" w:styleId="FrameContentsuser">
+    <w:name w:val="Frame Contents (user)"/>
     <w:basedOn w:val="Normal"/>
     <w:qFormat/>
     <w:pPr/>

</xml_diff>